<commit_message>
Add: basic folder structur and register and login
</commit_message>
<xml_diff>
--- a/Algorithm.docx
+++ b/Algorithm.docx
@@ -1,6 +1,6 @@
 
 <file path=word/document.xml><?xml version="1.0" encoding="utf-8"?>
-<w:document xmlns:wpc="http://schemas.microsoft.com/office/word/2010/wordprocessingCanvas" xmlns:cx="http://schemas.microsoft.com/office/drawing/2014/chartex" xmlns:mc="http://schemas.openxmlformats.org/markup-compatibility/2006" xmlns:o="urn:schemas-microsoft-com:office:office" xmlns:r="http://schemas.openxmlformats.org/officeDocument/2006/relationships" xmlns:m="http://schemas.openxmlformats.org/officeDocument/2006/math" xmlns:v="urn:schemas-microsoft-com:vml" xmlns:wp14="http://schemas.microsoft.com/office/word/2010/wordprocessingDrawing" xmlns:wp="http://schemas.openxmlformats.org/drawingml/2006/wordprocessingDrawing" xmlns:w10="urn:schemas-microsoft-com:office:word" xmlns:w="http://schemas.openxmlformats.org/wordprocessingml/2006/main" xmlns:w14="http://schemas.microsoft.com/office/word/2010/wordml" xmlns:w15="http://schemas.microsoft.com/office/word/2012/wordml" xmlns:w16se="http://schemas.microsoft.com/office/word/2015/wordml/symex" xmlns:wpg="http://schemas.microsoft.com/office/word/2010/wordprocessingGroup" xmlns:wpi="http://schemas.microsoft.com/office/word/2010/wordprocessingInk" xmlns:wne="http://schemas.microsoft.com/office/word/2006/wordml" xmlns:wps="http://schemas.microsoft.com/office/word/2010/wordprocessingShape" mc:Ignorable="w14 w15 w16se wp14">
+<w:document xmlns:wpc="http://schemas.microsoft.com/office/word/2010/wordprocessingCanvas" xmlns:cx="http://schemas.microsoft.com/office/drawing/2014/chartex" xmlns:cx1="http://schemas.microsoft.com/office/drawing/2015/9/8/chartex" xmlns:mc="http://schemas.openxmlformats.org/markup-compatibility/2006" xmlns:o="urn:schemas-microsoft-com:office:office" xmlns:r="http://schemas.openxmlformats.org/officeDocument/2006/relationships" xmlns:m="http://schemas.openxmlformats.org/officeDocument/2006/math" xmlns:v="urn:schemas-microsoft-com:vml" xmlns:wp14="http://schemas.microsoft.com/office/word/2010/wordprocessingDrawing" xmlns:wp="http://schemas.openxmlformats.org/drawingml/2006/wordprocessingDrawing" xmlns:w10="urn:schemas-microsoft-com:office:word" xmlns:w="http://schemas.openxmlformats.org/wordprocessingml/2006/main" xmlns:w14="http://schemas.microsoft.com/office/word/2010/wordml" xmlns:w15="http://schemas.microsoft.com/office/word/2012/wordml" xmlns:w16se="http://schemas.microsoft.com/office/word/2015/wordml/symex" xmlns:wpg="http://schemas.microsoft.com/office/word/2010/wordprocessingGroup" xmlns:wpi="http://schemas.microsoft.com/office/word/2010/wordprocessingInk" xmlns:wne="http://schemas.microsoft.com/office/word/2006/wordml" xmlns:wps="http://schemas.microsoft.com/office/word/2010/wordprocessingShape" mc:Ignorable="w14 w15 w16se wp14">
   <w:body>
     <w:p>
       <w:pPr>
@@ -148,70 +148,124 @@
         <w:t xml:space="preserve"> in the app and use the </w:t>
       </w:r>
       <w:proofErr w:type="spellStart"/>
+      <w:r>
+        <w:t>app.listen</w:t>
+      </w:r>
+      <w:proofErr w:type="spellEnd"/>
+      <w:r>
+        <w:t xml:space="preserve"> method to check whether the server is running successfully.</w:t>
+      </w:r>
+      <w:r>
+        <w:t xml:space="preserve"> And if we make any changes to the line in the listen method it will automatically update in the console.</w:t>
+      </w:r>
+    </w:p>
+    <w:p>
+      <w:pPr>
+        <w:pStyle w:val="ListParagraph"/>
+        <w:numPr>
+          <w:ilvl w:val="0"/>
+          <w:numId w:val="1"/>
+        </w:numPr>
+      </w:pPr>
+      <w:r>
+        <w:t xml:space="preserve">Now add the libraries which are installed above in the form of </w:t>
+      </w:r>
+      <w:proofErr w:type="spellStart"/>
+      <w:r>
+        <w:t>consts</w:t>
+      </w:r>
+      <w:proofErr w:type="spellEnd"/>
+      <w:r>
+        <w:t xml:space="preserve"> just like express.</w:t>
+      </w:r>
+    </w:p>
+    <w:p>
+      <w:pPr>
+        <w:pStyle w:val="ListParagraph"/>
+        <w:numPr>
+          <w:ilvl w:val="0"/>
+          <w:numId w:val="1"/>
+        </w:numPr>
+      </w:pPr>
+      <w:r>
+        <w:t>Now for .</w:t>
+      </w:r>
+      <w:proofErr w:type="spellStart"/>
+      <w:r>
+        <w:t>env</w:t>
+      </w:r>
+      <w:proofErr w:type="spellEnd"/>
+      <w:r>
+        <w:t xml:space="preserve"> write .</w:t>
+      </w:r>
+      <w:proofErr w:type="spellStart"/>
+      <w:r>
+        <w:t>env.config</w:t>
+      </w:r>
+      <w:proofErr w:type="spellEnd"/>
+      <w:r>
+        <w:t xml:space="preserve"> and create a new .</w:t>
+      </w:r>
+      <w:proofErr w:type="spellStart"/>
+      <w:r>
+        <w:t>env</w:t>
+      </w:r>
+      <w:proofErr w:type="spellEnd"/>
+      <w:r>
+        <w:t xml:space="preserve"> file.</w:t>
+      </w:r>
+    </w:p>
+    <w:p>
+      <w:pPr>
+        <w:pStyle w:val="ListParagraph"/>
+        <w:numPr>
+          <w:ilvl w:val="0"/>
+          <w:numId w:val="1"/>
+        </w:numPr>
+      </w:pPr>
+      <w:r>
+        <w:t>Now go to cloud.m</w:t>
+      </w:r>
+      <w:r>
+        <w:t xml:space="preserve">ongodb.com and create a cluster and copy the connection URL from the connection methods and insert username and password in the </w:t>
+      </w:r>
+      <w:proofErr w:type="spellStart"/>
       <w:proofErr w:type="gramStart"/>
       <w:r>
-        <w:t>app.listen</w:t>
+        <w:t>url</w:t>
       </w:r>
       <w:proofErr w:type="spellEnd"/>
       <w:proofErr w:type="gramEnd"/>
       <w:r>
-        <w:t xml:space="preserve"> method to check whether the server is running successfully.</w:t>
-      </w:r>
-      <w:r>
-        <w:t xml:space="preserve"> And if we make any changes to the line in the listen method it will automatically update in the console.</w:t>
-      </w:r>
-    </w:p>
-    <w:p>
-      <w:pPr>
-        <w:pStyle w:val="ListParagraph"/>
-        <w:numPr>
-          <w:ilvl w:val="0"/>
-          <w:numId w:val="1"/>
-        </w:numPr>
-      </w:pPr>
-      <w:r>
-        <w:t xml:space="preserve">Now add the libraries which are installed above in the form of </w:t>
-      </w:r>
-      <w:proofErr w:type="spellStart"/>
-      <w:r>
-        <w:t>consts</w:t>
-      </w:r>
-      <w:proofErr w:type="spellEnd"/>
-      <w:r>
-        <w:t xml:space="preserve"> just like express.</w:t>
-      </w:r>
-    </w:p>
-    <w:p>
-      <w:pPr>
-        <w:pStyle w:val="ListParagraph"/>
-        <w:numPr>
-          <w:ilvl w:val="0"/>
-          <w:numId w:val="1"/>
-        </w:numPr>
-      </w:pPr>
-      <w:r>
-        <w:t xml:space="preserve">Now </w:t>
-      </w:r>
-      <w:proofErr w:type="gramStart"/>
-      <w:r>
-        <w:t>for .</w:t>
+        <w:t xml:space="preserve"> and place this URL in the .</w:t>
       </w:r>
       <w:proofErr w:type="spellStart"/>
       <w:r>
         <w:t>env</w:t>
       </w:r>
       <w:proofErr w:type="spellEnd"/>
-      <w:proofErr w:type="gramEnd"/>
-      <w:r>
-        <w:t xml:space="preserve"> write .</w:t>
-      </w:r>
-      <w:proofErr w:type="spellStart"/>
-      <w:r>
-        <w:t>env.config</w:t>
-      </w:r>
-      <w:proofErr w:type="spellEnd"/>
-      <w:r>
-        <w:t xml:space="preserve"> and create a new .</w:t>
+      <w:r>
+        <w:t xml:space="preserve"> file which can be created by making new file in the root folder and also adding it to </w:t>
+      </w:r>
+      <w:proofErr w:type="spellStart"/>
+      <w:r>
+        <w:t>gitignore</w:t>
+      </w:r>
+      <w:proofErr w:type="spellEnd"/>
+      <w:r>
+        <w:t xml:space="preserve"> file.</w:t>
+      </w:r>
+    </w:p>
+    <w:p>
+      <w:pPr>
+        <w:pStyle w:val="ListParagraph"/>
+        <w:numPr>
+          <w:ilvl w:val="0"/>
+          <w:numId w:val="1"/>
+        </w:numPr>
+      </w:pPr>
+      <w:r>
+        <w:t>Now go to mongoose connection web page and copy the code into the index file and replace the URL present in it by the MONGO_URL which is present in the .</w:t>
       </w:r>
       <w:proofErr w:type="spellStart"/>
       <w:r>
@@ -231,76 +285,277 @@
         </w:numPr>
       </w:pPr>
       <w:r>
-        <w:t>Now go to cloud.m</w:t>
-      </w:r>
-      <w:r>
-        <w:t xml:space="preserve">ongodb.com and create a cluster and copy the connection URL from the connection methods and insert username and password in the </w:t>
-      </w:r>
-      <w:proofErr w:type="spellStart"/>
-      <w:r>
-        <w:t>url</w:t>
-      </w:r>
-      <w:proofErr w:type="spellEnd"/>
-      <w:r>
-        <w:t xml:space="preserve"> and place this URL in </w:t>
-      </w:r>
-      <w:proofErr w:type="gramStart"/>
-      <w:r>
-        <w:t>the .</w:t>
-      </w:r>
-      <w:proofErr w:type="spellStart"/>
-      <w:r>
-        <w:t>env</w:t>
-      </w:r>
-      <w:proofErr w:type="spellEnd"/>
-      <w:proofErr w:type="gramEnd"/>
-      <w:r>
-        <w:t xml:space="preserve"> file which can be created by making new file in the root folder and also adding it to </w:t>
-      </w:r>
-      <w:proofErr w:type="spellStart"/>
-      <w:r>
-        <w:t>gitignore</w:t>
-      </w:r>
-      <w:proofErr w:type="spellEnd"/>
-      <w:r>
-        <w:t xml:space="preserve"> file.</w:t>
-      </w:r>
-    </w:p>
-    <w:p>
-      <w:pPr>
-        <w:pStyle w:val="ListParagraph"/>
-        <w:numPr>
-          <w:ilvl w:val="0"/>
-          <w:numId w:val="1"/>
-        </w:numPr>
-      </w:pPr>
-      <w:r>
-        <w:t xml:space="preserve">Now go to mongoose connection web page and copy the code into the index file and replace the URL present in it by the MONGO_URL which is present in </w:t>
-      </w:r>
-      <w:proofErr w:type="gramStart"/>
-      <w:r>
-        <w:t>the .</w:t>
-      </w:r>
-      <w:proofErr w:type="spellStart"/>
-      <w:r>
-        <w:t>env</w:t>
-      </w:r>
-      <w:proofErr w:type="spellEnd"/>
-      <w:proofErr w:type="gramEnd"/>
-      <w:r>
-        <w:t xml:space="preserve"> file.</w:t>
-      </w:r>
-    </w:p>
-    <w:p>
-      <w:pPr>
-        <w:pStyle w:val="ListParagraph"/>
-        <w:numPr>
-          <w:ilvl w:val="0"/>
-          <w:numId w:val="1"/>
-        </w:numPr>
-      </w:pPr>
+        <w:t xml:space="preserve">Here both the server and the connection to </w:t>
+      </w:r>
+      <w:proofErr w:type="spellStart"/>
+      <w:r>
+        <w:t>mongoDB</w:t>
+      </w:r>
+      <w:proofErr w:type="spellEnd"/>
+      <w:r>
+        <w:t xml:space="preserve"> should be running</w:t>
+      </w:r>
+    </w:p>
+    <w:p>
+      <w:pPr>
+        <w:pStyle w:val="ListParagraph"/>
+        <w:numPr>
+          <w:ilvl w:val="0"/>
+          <w:numId w:val="1"/>
+        </w:numPr>
+      </w:pPr>
+      <w:r>
+        <w:t xml:space="preserve">Now add </w:t>
+      </w:r>
+      <w:proofErr w:type="spellStart"/>
+      <w:r>
+        <w:t>middlewares</w:t>
+      </w:r>
+      <w:proofErr w:type="spellEnd"/>
+      <w:r>
+        <w:t xml:space="preserve"> using </w:t>
+      </w:r>
+      <w:proofErr w:type="spellStart"/>
+      <w:r>
+        <w:t>app.use</w:t>
+      </w:r>
+      <w:proofErr w:type="spellEnd"/>
+      <w:r>
+        <w:t>(</w:t>
+      </w:r>
+      <w:proofErr w:type="spellStart"/>
+      <w:r>
+        <w:t>express.json</w:t>
+      </w:r>
+      <w:proofErr w:type="spellEnd"/>
+      <w:r>
+        <w:t xml:space="preserve">(), helmet() and </w:t>
+      </w:r>
+      <w:proofErr w:type="spellStart"/>
+      <w:r>
+        <w:t>morgan</w:t>
+      </w:r>
+      <w:proofErr w:type="spellEnd"/>
+      <w:r>
+        <w:t>(“common”))</w:t>
+      </w:r>
+    </w:p>
+    <w:p>
+      <w:pPr>
+        <w:pStyle w:val="ListParagraph"/>
+        <w:numPr>
+          <w:ilvl w:val="0"/>
+          <w:numId w:val="1"/>
+        </w:numPr>
+      </w:pPr>
+      <w:r>
+        <w:t>Now create a new folder routes and inside it first file userRoutes.js</w:t>
+      </w:r>
+      <w:r>
+        <w:t xml:space="preserve"> in it import Router from “express” and use a </w:t>
+      </w:r>
+      <w:proofErr w:type="spellStart"/>
+      <w:r>
+        <w:t>const</w:t>
+      </w:r>
+      <w:proofErr w:type="spellEnd"/>
+      <w:r>
+        <w:t xml:space="preserve"> </w:t>
+      </w:r>
+      <w:proofErr w:type="spellStart"/>
+      <w:r>
+        <w:t>userRouter</w:t>
+      </w:r>
+      <w:proofErr w:type="spellEnd"/>
+      <w:r>
+        <w:t xml:space="preserve"> to initialize it and export it as default.</w:t>
+      </w:r>
+    </w:p>
+    <w:p>
+      <w:pPr>
+        <w:pStyle w:val="ListParagraph"/>
+        <w:numPr>
+          <w:ilvl w:val="0"/>
+          <w:numId w:val="1"/>
+        </w:numPr>
+      </w:pPr>
+      <w:r>
+        <w:t xml:space="preserve">Now import this </w:t>
+      </w:r>
+      <w:proofErr w:type="spellStart"/>
+      <w:r>
+        <w:t>const</w:t>
+      </w:r>
+      <w:proofErr w:type="spellEnd"/>
+      <w:r>
+        <w:t xml:space="preserve"> in the index.js and use it in </w:t>
+      </w:r>
+      <w:proofErr w:type="spellStart"/>
+      <w:r>
+        <w:t>app.use</w:t>
+      </w:r>
+      <w:proofErr w:type="spellEnd"/>
+      <w:r>
+        <w:t>(“/</w:t>
+      </w:r>
+      <w:proofErr w:type="spellStart"/>
+      <w:r>
+        <w:t>api</w:t>
+      </w:r>
+      <w:proofErr w:type="spellEnd"/>
+      <w:r>
+        <w:t xml:space="preserve">/v1/user”, </w:t>
+      </w:r>
+      <w:proofErr w:type="spellStart"/>
+      <w:r>
+        <w:t>userRouter</w:t>
+      </w:r>
+      <w:proofErr w:type="spellEnd"/>
+      <w:r>
+        <w:t>);</w:t>
+      </w:r>
+    </w:p>
+    <w:p>
+      <w:pPr>
+        <w:pStyle w:val="ListParagraph"/>
+        <w:numPr>
+          <w:ilvl w:val="0"/>
+          <w:numId w:val="1"/>
+        </w:numPr>
+      </w:pPr>
+      <w:r>
+        <w:t xml:space="preserve">Now create another file authRoutes.js in the routes folder which will be used as authentication routes file and copy the whole code of </w:t>
+      </w:r>
+      <w:proofErr w:type="spellStart"/>
+      <w:r>
+        <w:t>userRoutes</w:t>
+      </w:r>
+      <w:proofErr w:type="spellEnd"/>
+      <w:r>
+        <w:t xml:space="preserve"> in it just change the user to </w:t>
+      </w:r>
+      <w:proofErr w:type="spellStart"/>
+      <w:r>
+        <w:t>auth</w:t>
+      </w:r>
+      <w:proofErr w:type="spellEnd"/>
+      <w:r>
+        <w:t xml:space="preserve"> and also call it in the index.js file.</w:t>
+      </w:r>
+    </w:p>
+    <w:p>
+      <w:pPr>
+        <w:pStyle w:val="ListParagraph"/>
+        <w:numPr>
+          <w:ilvl w:val="0"/>
+          <w:numId w:val="1"/>
+        </w:numPr>
+      </w:pPr>
+      <w:r>
+        <w:t>Now create a models folder and inside create a file userModel.js</w:t>
+      </w:r>
+      <w:r>
+        <w:t>.</w:t>
+      </w:r>
+    </w:p>
+    <w:p>
+      <w:pPr>
+        <w:pStyle w:val="ListParagraph"/>
+        <w:numPr>
+          <w:ilvl w:val="0"/>
+          <w:numId w:val="1"/>
+        </w:numPr>
+      </w:pPr>
+      <w:r>
+        <w:t>In the file import mongoose and {Schema} from ‘mongoose’</w:t>
+      </w:r>
+      <w:r>
+        <w:t xml:space="preserve"> and create a </w:t>
+      </w:r>
+      <w:proofErr w:type="spellStart"/>
+      <w:r>
+        <w:t>userSchema</w:t>
+      </w:r>
+      <w:proofErr w:type="spellEnd"/>
+      <w:r>
+        <w:t xml:space="preserve"> through new Schema</w:t>
+      </w:r>
+      <w:r>
+        <w:t xml:space="preserve">({}) and add the key, values for username, email, password, </w:t>
+      </w:r>
+      <w:proofErr w:type="spellStart"/>
+      <w:r>
+        <w:t>profilepic</w:t>
+      </w:r>
+      <w:proofErr w:type="spellEnd"/>
+      <w:r>
+        <w:t xml:space="preserve">, </w:t>
+      </w:r>
+      <w:proofErr w:type="spellStart"/>
+      <w:r>
+        <w:t>coverpic</w:t>
+      </w:r>
+      <w:proofErr w:type="spellEnd"/>
+      <w:r>
+        <w:t xml:space="preserve">, followers, following, </w:t>
+      </w:r>
+      <w:proofErr w:type="spellStart"/>
+      <w:r>
+        <w:t>isAdmin</w:t>
+      </w:r>
+      <w:proofErr w:type="spellEnd"/>
+      <w:r>
+        <w:t xml:space="preserve"> and then the timestamps and then</w:t>
+      </w:r>
       <w:bookmarkStart w:id="0" w:name="_GoBack"/>
       <w:bookmarkEnd w:id="0"/>
+      <w:r>
+        <w:t xml:space="preserve"> export </w:t>
+      </w:r>
+      <w:proofErr w:type="spellStart"/>
+      <w:r>
+        <w:t>const</w:t>
+      </w:r>
+      <w:proofErr w:type="spellEnd"/>
+      <w:r>
+        <w:t xml:space="preserve"> </w:t>
+      </w:r>
+      <w:proofErr w:type="spellStart"/>
+      <w:r>
+        <w:t>userModel</w:t>
+      </w:r>
+      <w:proofErr w:type="spellEnd"/>
+      <w:r>
+        <w:t>=</w:t>
+      </w:r>
+      <w:proofErr w:type="spellStart"/>
+      <w:r>
+        <w:t>mongoose.model</w:t>
+      </w:r>
+      <w:proofErr w:type="spellEnd"/>
+      <w:r>
+        <w:t>(“user”,</w:t>
+      </w:r>
+      <w:proofErr w:type="spellStart"/>
+      <w:r>
+        <w:t>userSchema</w:t>
+      </w:r>
+      <w:proofErr w:type="spellEnd"/>
+      <w:r>
+        <w:t>)</w:t>
+      </w:r>
+    </w:p>
+    <w:p>
+      <w:pPr>
+        <w:pStyle w:val="ListParagraph"/>
+        <w:numPr>
+          <w:ilvl w:val="0"/>
+          <w:numId w:val="1"/>
+        </w:numPr>
+      </w:pPr>
+      <w:r>
+        <w:t xml:space="preserve"> </w:t>
+      </w:r>
     </w:p>
     <w:sectPr>
       <w:pgSz w:w="12240" w:h="15840"/>
@@ -313,7 +568,7 @@
 </file>
 
 <file path=word/numbering.xml><?xml version="1.0" encoding="utf-8"?>
-<w:numbering xmlns:wpc="http://schemas.microsoft.com/office/word/2010/wordprocessingCanvas" xmlns:cx="http://schemas.microsoft.com/office/drawing/2014/chartex" xmlns:mc="http://schemas.openxmlformats.org/markup-compatibility/2006" xmlns:o="urn:schemas-microsoft-com:office:office" xmlns:r="http://schemas.openxmlformats.org/officeDocument/2006/relationships" xmlns:m="http://schemas.openxmlformats.org/officeDocument/2006/math" xmlns:v="urn:schemas-microsoft-com:vml" xmlns:wp14="http://schemas.microsoft.com/office/word/2010/wordprocessingDrawing" xmlns:wp="http://schemas.openxmlformats.org/drawingml/2006/wordprocessingDrawing" xmlns:w10="urn:schemas-microsoft-com:office:word" xmlns:w="http://schemas.openxmlformats.org/wordprocessingml/2006/main" xmlns:w14="http://schemas.microsoft.com/office/word/2010/wordml" xmlns:w15="http://schemas.microsoft.com/office/word/2012/wordml" xmlns:w16se="http://schemas.microsoft.com/office/word/2015/wordml/symex" xmlns:wpg="http://schemas.microsoft.com/office/word/2010/wordprocessingGroup" xmlns:wpi="http://schemas.microsoft.com/office/word/2010/wordprocessingInk" xmlns:wne="http://schemas.microsoft.com/office/word/2006/wordml" xmlns:wps="http://schemas.microsoft.com/office/word/2010/wordprocessingShape" mc:Ignorable="w14 w15 w16se wp14">
+<w:numbering xmlns:wpc="http://schemas.microsoft.com/office/word/2010/wordprocessingCanvas" xmlns:cx="http://schemas.microsoft.com/office/drawing/2014/chartex" xmlns:cx1="http://schemas.microsoft.com/office/drawing/2015/9/8/chartex" xmlns:mc="http://schemas.openxmlformats.org/markup-compatibility/2006" xmlns:o="urn:schemas-microsoft-com:office:office" xmlns:r="http://schemas.openxmlformats.org/officeDocument/2006/relationships" xmlns:m="http://schemas.openxmlformats.org/officeDocument/2006/math" xmlns:v="urn:schemas-microsoft-com:vml" xmlns:wp14="http://schemas.microsoft.com/office/word/2010/wordprocessingDrawing" xmlns:wp="http://schemas.openxmlformats.org/drawingml/2006/wordprocessingDrawing" xmlns:w10="urn:schemas-microsoft-com:office:word" xmlns:w="http://schemas.openxmlformats.org/wordprocessingml/2006/main" xmlns:w14="http://schemas.microsoft.com/office/word/2010/wordml" xmlns:w15="http://schemas.microsoft.com/office/word/2012/wordml" xmlns:w16se="http://schemas.microsoft.com/office/word/2015/wordml/symex" xmlns:wpg="http://schemas.microsoft.com/office/word/2010/wordprocessingGroup" xmlns:wpi="http://schemas.microsoft.com/office/word/2010/wordprocessingInk" xmlns:wne="http://schemas.microsoft.com/office/word/2006/wordml" xmlns:wps="http://schemas.microsoft.com/office/word/2010/wordprocessingShape" mc:Ignorable="w14 w15 w16se wp14">
   <w:abstractNum w:abstractNumId="0" w15:restartNumberingAfterBreak="0">
     <w:nsid w:val="5CAC7106"/>
     <w:multiLevelType w:val="hybridMultilevel"/>

</xml_diff>